<commit_message>
Update cover letter addressee to current CSDA Co-Editors
Co-Authored-By: Tatsuki Onishi <bougtoir@gmail.com>
</commit_message>
<xml_diff>
--- a/results/manuscript/csda_submission/cover_letter_csda_v1.docx
+++ b/results/manuscript/csda_submission/cover_letter_csda_v1.docx
@@ -29,7 +29,12 @@
     </w:p>
     <w:p>
       <w:r>
-        <w:t>The Editors</w:t>
+        <w:t>Drs. Ana Maria Colubi, Erricos Kontoghiorghes and Byeong Park</w:t>
+      </w:r>
+    </w:p>
+    <w:p>
+      <w:r>
+        <w:t>Co-Editors</w:t>
       </w:r>
     </w:p>
     <w:p>
@@ -49,7 +54,7 @@
     </w:p>
     <w:p>
       <w:r>
-        <w:t>Dear Editors,</w:t>
+        <w:t>Dear Drs. Colubi, Kontoghiorghes and Park:</w:t>
       </w:r>
     </w:p>
     <w:p>

</xml_diff>